<commit_message>
Small changes to upgrade notes.
</commit_message>
<xml_diff>
--- a/NN26_27/NN26-27_Upgrade_Notes.docx
+++ b/NN26_27/NN26-27_Upgrade_Notes.docx
@@ -8,6 +8,11 @@
       </w:pPr>
       <w:r>
         <w:t>NinjaNIRS 2026/27 Upgrade Notes</w:t>
+      </w:r>
+    </w:p>
+    <w:p>
+      <w:r>
+        <w:t>As of July 27, 2026</w:t>
       </w:r>
     </w:p>
     <w:p>
@@ -501,7 +506,6 @@
         <w:pStyle w:val="Heading2"/>
       </w:pPr>
       <w:r>
-        <w:lastRenderedPageBreak/>
         <w:t>Backplane</w:t>
       </w:r>
     </w:p>
@@ -694,9 +698,9 @@
       </w:tblPr>
       <w:tblGrid>
         <w:gridCol w:w="1409"/>
-        <w:gridCol w:w="1889"/>
-        <w:gridCol w:w="1710"/>
-        <w:gridCol w:w="4342"/>
+        <w:gridCol w:w="2217"/>
+        <w:gridCol w:w="1634"/>
+        <w:gridCol w:w="4090"/>
       </w:tblGrid>
       <w:tr>
         <w:tc>
@@ -831,7 +835,10 @@
           </w:tcPr>
           <w:p>
             <w:r>
-              <w:t>New component; does not exist in prev.</w:t>
+              <w:t>New component</w:t>
+            </w:r>
+            <w:r>
+              <w:t xml:space="preserve"> / designator</w:t>
             </w:r>
           </w:p>
         </w:tc>
@@ -843,7 +850,7 @@
           </w:tcPr>
           <w:p>
             <w:r>
-              <w:t>U13</w:t>
+              <w:t>LF1</w:t>
             </w:r>
           </w:p>
         </w:tc>
@@ -853,7 +860,7 @@
           </w:tcPr>
           <w:p>
             <w:r>
-              <w:t>ADP7142</w:t>
+              <w:t>BLM18AG601SN1D</w:t>
             </w:r>
           </w:p>
         </w:tc>
@@ -871,85 +878,23 @@
           <w:tcPr>
             <w:tcW w:w="4342" w:type="dxa"/>
           </w:tcPr>
-          <w:p/>
-        </w:tc>
-      </w:tr>
-      <w:tr>
-        <w:tc>
-          <w:tcPr>
-            <w:tcW w:w="1409" w:type="dxa"/>
-          </w:tcPr>
-          <w:p>
-            <w:r>
-              <w:t>C104</w:t>
-            </w:r>
-          </w:p>
-        </w:tc>
-        <w:tc>
-          <w:tcPr>
-            <w:tcW w:w="1889" w:type="dxa"/>
-          </w:tcPr>
-          <w:p>
-            <w:r>
-              <w:t>10uF</w:t>
-            </w:r>
-          </w:p>
-        </w:tc>
-        <w:tc>
-          <w:tcPr>
-            <w:tcW w:w="1710" w:type="dxa"/>
-          </w:tcPr>
-          <w:p>
-            <w:r>
-              <w:t>DNP</w:t>
-            </w:r>
-          </w:p>
-        </w:tc>
-        <w:tc>
-          <w:tcPr>
-            <w:tcW w:w="4342" w:type="dxa"/>
-          </w:tcPr>
-          <w:p/>
-        </w:tc>
-      </w:tr>
-      <w:tr>
-        <w:tc>
-          <w:tcPr>
-            <w:tcW w:w="1409" w:type="dxa"/>
-          </w:tcPr>
-          <w:p>
-            <w:r>
-              <w:t>LF1</w:t>
-            </w:r>
-          </w:p>
-        </w:tc>
-        <w:tc>
-          <w:tcPr>
-            <w:tcW w:w="1889" w:type="dxa"/>
-          </w:tcPr>
-          <w:p/>
-        </w:tc>
-        <w:tc>
-          <w:tcPr>
-            <w:tcW w:w="1710" w:type="dxa"/>
-          </w:tcPr>
-          <w:p>
-            <w:r>
-              <w:t>DNP</w:t>
-            </w:r>
-          </w:p>
-        </w:tc>
-        <w:tc>
-          <w:tcPr>
-            <w:tcW w:w="4342" w:type="dxa"/>
-          </w:tcPr>
-          <w:p/>
+          <w:p>
+            <w:r>
+              <w:t>Ferrite 600 Ohm @ 100 MHz, 500 mA</w:t>
+            </w:r>
+          </w:p>
         </w:tc>
       </w:tr>
     </w:tbl>
     <w:p>
       <w:r>
-        <w:t>Additional components could be DNP’d in NN27 if desired.</w:t>
+        <w:t>Additional components could be DNP’d in NN27 if desired</w:t>
+      </w:r>
+      <w:r>
+        <w:t>, such as U13 and C104</w:t>
+      </w:r>
+      <w:r>
+        <w:t>.</w:t>
       </w:r>
     </w:p>
     <w:p>
@@ -986,12 +931,17 @@
     </w:p>
     <w:p>
       <w:r>
+        <w:br w:type="page"/>
+      </w:r>
+    </w:p>
+    <w:p>
+      <w:r>
+        <w:lastRenderedPageBreak/>
         <w:t>Here are the necessary changes on the v3 control card:</w:t>
       </w:r>
     </w:p>
     <w:p>
       <w:r>
-        <w:lastRenderedPageBreak/>
         <w:t>On the front side of the card, bridge pads 3 and 5 of connector footprint J901.</w:t>
       </w:r>
     </w:p>
@@ -1125,6 +1075,7 @@
         <w:pStyle w:val="Heading2"/>
       </w:pPr>
       <w:r>
+        <w:lastRenderedPageBreak/>
         <w:t>System Case</w:t>
       </w:r>
     </w:p>
@@ -1138,7 +1089,6 @@
         <w:pStyle w:val="Heading2"/>
       </w:pPr>
       <w:r>
-        <w:lastRenderedPageBreak/>
         <w:t>Firmware / NinjaWeb GUI</w:t>
       </w:r>
     </w:p>
@@ -1775,7 +1725,6 @@
   <w:style w:type="character" w:default="1" w:styleId="DefaultParagraphFont">
     <w:name w:val="Default Paragraph Font"/>
     <w:uiPriority w:val="1"/>
-    <w:semiHidden/>
     <w:unhideWhenUsed/>
   </w:style>
   <w:style w:type="table" w:default="1" w:styleId="TableNormal">

</xml_diff>